<commit_message>
Fix: Add product-page admin
</commit_message>
<xml_diff>
--- a/ghi-chu.docx
+++ b/ghi-chu.docx
@@ -381,6 +381,9 @@
         <w:jc w:val="center"/>
       </w:pPr>
       <w:r>
+        <w:rPr>
+          <w:noProof/>
+        </w:rPr>
         <w:drawing>
           <wp:inline distT="0" distB="0" distL="0" distR="0" wp14:anchorId="70C47374" wp14:editId="3B8E0E38">
             <wp:extent cx="4734586" cy="2229161"/>
@@ -423,6 +426,9 @@
         <w:jc w:val="center"/>
       </w:pPr>
       <w:r>
+        <w:rPr>
+          <w:noProof/>
+        </w:rPr>
         <w:drawing>
           <wp:inline distT="0" distB="0" distL="0" distR="0" wp14:anchorId="4AD57983" wp14:editId="7AA38182">
             <wp:extent cx="4658375" cy="3181794"/>
@@ -460,6 +466,420 @@
         </w:drawing>
       </w:r>
     </w:p>
+    <w:p>
+      <w:r>
+        <w:br w:type="page"/>
+      </w:r>
+    </w:p>
+    <w:p>
+      <w:pPr>
+        <w:jc w:val="center"/>
+        <w:rPr>
+          <w:b/>
+          <w:bCs/>
+          <w:sz w:val="32"/>
+          <w:szCs w:val="32"/>
+        </w:rPr>
+      </w:pPr>
+      <w:r>
+        <w:rPr>
+          <w:b/>
+          <w:bCs/>
+          <w:sz w:val="32"/>
+          <w:szCs w:val="32"/>
+        </w:rPr>
+        <w:lastRenderedPageBreak/>
+        <w:t>Null trong ASP.NET</w:t>
+      </w:r>
+    </w:p>
+    <w:p>
+      <w:r>
+        <w:rPr>
+          <w:noProof/>
+        </w:rPr>
+        <w:drawing>
+          <wp:inline distT="0" distB="0" distL="0" distR="0" wp14:anchorId="5F9023CB" wp14:editId="6351ECA2">
+            <wp:extent cx="5943600" cy="1689735"/>
+            <wp:effectExtent l="0" t="0" r="0" b="5715"/>
+            <wp:docPr id="825790967" name="Picture 1"/>
+            <wp:cNvGraphicFramePr>
+              <a:graphicFrameLocks xmlns:a="http://schemas.openxmlformats.org/drawingml/2006/main" noChangeAspect="1"/>
+            </wp:cNvGraphicFramePr>
+            <a:graphic xmlns:a="http://schemas.openxmlformats.org/drawingml/2006/main">
+              <a:graphicData uri="http://schemas.openxmlformats.org/drawingml/2006/picture">
+                <pic:pic xmlns:pic="http://schemas.openxmlformats.org/drawingml/2006/picture">
+                  <pic:nvPicPr>
+                    <pic:cNvPr id="825790967" name=""/>
+                    <pic:cNvPicPr/>
+                  </pic:nvPicPr>
+                  <pic:blipFill>
+                    <a:blip r:embed="rId9"/>
+                    <a:stretch>
+                      <a:fillRect/>
+                    </a:stretch>
+                  </pic:blipFill>
+                  <pic:spPr>
+                    <a:xfrm>
+                      <a:off x="0" y="0"/>
+                      <a:ext cx="5943600" cy="1689735"/>
+                    </a:xfrm>
+                    <a:prstGeom prst="rect">
+                      <a:avLst/>
+                    </a:prstGeom>
+                  </pic:spPr>
+                </pic:pic>
+              </a:graphicData>
+            </a:graphic>
+          </wp:inline>
+        </w:drawing>
+      </w:r>
+    </w:p>
+    <w:p>
+      <w:r>
+        <w:rPr>
+          <w:noProof/>
+        </w:rPr>
+        <w:drawing>
+          <wp:inline distT="0" distB="0" distL="0" distR="0" wp14:anchorId="69869C12" wp14:editId="4645B2D6">
+            <wp:extent cx="5943600" cy="3074670"/>
+            <wp:effectExtent l="0" t="0" r="0" b="0"/>
+            <wp:docPr id="570730131" name="Picture 1"/>
+            <wp:cNvGraphicFramePr>
+              <a:graphicFrameLocks xmlns:a="http://schemas.openxmlformats.org/drawingml/2006/main" noChangeAspect="1"/>
+            </wp:cNvGraphicFramePr>
+            <a:graphic xmlns:a="http://schemas.openxmlformats.org/drawingml/2006/main">
+              <a:graphicData uri="http://schemas.openxmlformats.org/drawingml/2006/picture">
+                <pic:pic xmlns:pic="http://schemas.openxmlformats.org/drawingml/2006/picture">
+                  <pic:nvPicPr>
+                    <pic:cNvPr id="570730131" name=""/>
+                    <pic:cNvPicPr/>
+                  </pic:nvPicPr>
+                  <pic:blipFill>
+                    <a:blip r:embed="rId10"/>
+                    <a:stretch>
+                      <a:fillRect/>
+                    </a:stretch>
+                  </pic:blipFill>
+                  <pic:spPr>
+                    <a:xfrm>
+                      <a:off x="0" y="0"/>
+                      <a:ext cx="5943600" cy="3074670"/>
+                    </a:xfrm>
+                    <a:prstGeom prst="rect">
+                      <a:avLst/>
+                    </a:prstGeom>
+                  </pic:spPr>
+                </pic:pic>
+              </a:graphicData>
+            </a:graphic>
+          </wp:inline>
+        </w:drawing>
+      </w:r>
+    </w:p>
+    <w:p>
+      <w:r>
+        <w:rPr>
+          <w:noProof/>
+        </w:rPr>
+        <w:drawing>
+          <wp:inline distT="0" distB="0" distL="0" distR="0" wp14:anchorId="7FF46E34" wp14:editId="7C65D2C6">
+            <wp:extent cx="5072932" cy="2520749"/>
+            <wp:effectExtent l="0" t="0" r="0" b="0"/>
+            <wp:docPr id="2251419" name="Picture 1"/>
+            <wp:cNvGraphicFramePr>
+              <a:graphicFrameLocks xmlns:a="http://schemas.openxmlformats.org/drawingml/2006/main" noChangeAspect="1"/>
+            </wp:cNvGraphicFramePr>
+            <a:graphic xmlns:a="http://schemas.openxmlformats.org/drawingml/2006/main">
+              <a:graphicData uri="http://schemas.openxmlformats.org/drawingml/2006/picture">
+                <pic:pic xmlns:pic="http://schemas.openxmlformats.org/drawingml/2006/picture">
+                  <pic:nvPicPr>
+                    <pic:cNvPr id="2251419" name=""/>
+                    <pic:cNvPicPr/>
+                  </pic:nvPicPr>
+                  <pic:blipFill>
+                    <a:blip r:embed="rId11"/>
+                    <a:stretch>
+                      <a:fillRect/>
+                    </a:stretch>
+                  </pic:blipFill>
+                  <pic:spPr>
+                    <a:xfrm>
+                      <a:off x="0" y="0"/>
+                      <a:ext cx="5075971" cy="2522259"/>
+                    </a:xfrm>
+                    <a:prstGeom prst="rect">
+                      <a:avLst/>
+                    </a:prstGeom>
+                  </pic:spPr>
+                </pic:pic>
+              </a:graphicData>
+            </a:graphic>
+          </wp:inline>
+        </w:drawing>
+      </w:r>
+    </w:p>
+    <w:p>
+      <w:pPr>
+        <w:jc w:val="center"/>
+        <w:rPr>
+          <w:b/>
+          <w:bCs/>
+          <w:sz w:val="32"/>
+          <w:szCs w:val="32"/>
+        </w:rPr>
+      </w:pPr>
+      <w:r>
+        <w:rPr>
+          <w:b/>
+          <w:bCs/>
+          <w:sz w:val="32"/>
+          <w:szCs w:val="32"/>
+        </w:rPr>
+        <w:lastRenderedPageBreak/>
+        <w:t>Navigation Property (Thuộc tính điều hướng)</w:t>
+      </w:r>
+    </w:p>
+    <w:p>
+      <w:r>
+        <w:rPr>
+          <w:noProof/>
+        </w:rPr>
+        <w:drawing>
+          <wp:inline distT="0" distB="0" distL="0" distR="0" wp14:anchorId="1A2BAE58" wp14:editId="784F5CB4">
+            <wp:extent cx="5943600" cy="2005965"/>
+            <wp:effectExtent l="0" t="0" r="0" b="0"/>
+            <wp:docPr id="846484975" name="Picture 1"/>
+            <wp:cNvGraphicFramePr>
+              <a:graphicFrameLocks xmlns:a="http://schemas.openxmlformats.org/drawingml/2006/main" noChangeAspect="1"/>
+            </wp:cNvGraphicFramePr>
+            <a:graphic xmlns:a="http://schemas.openxmlformats.org/drawingml/2006/main">
+              <a:graphicData uri="http://schemas.openxmlformats.org/drawingml/2006/picture">
+                <pic:pic xmlns:pic="http://schemas.openxmlformats.org/drawingml/2006/picture">
+                  <pic:nvPicPr>
+                    <pic:cNvPr id="846484975" name=""/>
+                    <pic:cNvPicPr/>
+                  </pic:nvPicPr>
+                  <pic:blipFill>
+                    <a:blip r:embed="rId12"/>
+                    <a:stretch>
+                      <a:fillRect/>
+                    </a:stretch>
+                  </pic:blipFill>
+                  <pic:spPr>
+                    <a:xfrm>
+                      <a:off x="0" y="0"/>
+                      <a:ext cx="5943600" cy="2005965"/>
+                    </a:xfrm>
+                    <a:prstGeom prst="rect">
+                      <a:avLst/>
+                    </a:prstGeom>
+                  </pic:spPr>
+                </pic:pic>
+              </a:graphicData>
+            </a:graphic>
+          </wp:inline>
+        </w:drawing>
+      </w:r>
+    </w:p>
+    <w:p>
+      <w:r>
+        <w:rPr>
+          <w:noProof/>
+        </w:rPr>
+        <w:drawing>
+          <wp:inline distT="0" distB="0" distL="0" distR="0" wp14:anchorId="6AF52A8D" wp14:editId="5A6E4348">
+            <wp:extent cx="4744112" cy="1286054"/>
+            <wp:effectExtent l="0" t="0" r="0" b="9525"/>
+            <wp:docPr id="159986253" name="Picture 1"/>
+            <wp:cNvGraphicFramePr>
+              <a:graphicFrameLocks xmlns:a="http://schemas.openxmlformats.org/drawingml/2006/main" noChangeAspect="1"/>
+            </wp:cNvGraphicFramePr>
+            <a:graphic xmlns:a="http://schemas.openxmlformats.org/drawingml/2006/main">
+              <a:graphicData uri="http://schemas.openxmlformats.org/drawingml/2006/picture">
+                <pic:pic xmlns:pic="http://schemas.openxmlformats.org/drawingml/2006/picture">
+                  <pic:nvPicPr>
+                    <pic:cNvPr id="159986253" name=""/>
+                    <pic:cNvPicPr/>
+                  </pic:nvPicPr>
+                  <pic:blipFill>
+                    <a:blip r:embed="rId13"/>
+                    <a:stretch>
+                      <a:fillRect/>
+                    </a:stretch>
+                  </pic:blipFill>
+                  <pic:spPr>
+                    <a:xfrm>
+                      <a:off x="0" y="0"/>
+                      <a:ext cx="4744112" cy="1286054"/>
+                    </a:xfrm>
+                    <a:prstGeom prst="rect">
+                      <a:avLst/>
+                    </a:prstGeom>
+                  </pic:spPr>
+                </pic:pic>
+              </a:graphicData>
+            </a:graphic>
+          </wp:inline>
+        </w:drawing>
+      </w:r>
+      <w:r>
+        <w:rPr>
+          <w:noProof/>
+        </w:rPr>
+        <w:drawing>
+          <wp:inline distT="0" distB="0" distL="0" distR="0" wp14:anchorId="16E0BC8C" wp14:editId="0EDD03DD">
+            <wp:extent cx="5943600" cy="4273550"/>
+            <wp:effectExtent l="0" t="0" r="0" b="0"/>
+            <wp:docPr id="2104857967" name="Picture 1"/>
+            <wp:cNvGraphicFramePr>
+              <a:graphicFrameLocks xmlns:a="http://schemas.openxmlformats.org/drawingml/2006/main" noChangeAspect="1"/>
+            </wp:cNvGraphicFramePr>
+            <a:graphic xmlns:a="http://schemas.openxmlformats.org/drawingml/2006/main">
+              <a:graphicData uri="http://schemas.openxmlformats.org/drawingml/2006/picture">
+                <pic:pic xmlns:pic="http://schemas.openxmlformats.org/drawingml/2006/picture">
+                  <pic:nvPicPr>
+                    <pic:cNvPr id="2104857967" name=""/>
+                    <pic:cNvPicPr/>
+                  </pic:nvPicPr>
+                  <pic:blipFill>
+                    <a:blip r:embed="rId14"/>
+                    <a:stretch>
+                      <a:fillRect/>
+                    </a:stretch>
+                  </pic:blipFill>
+                  <pic:spPr>
+                    <a:xfrm>
+                      <a:off x="0" y="0"/>
+                      <a:ext cx="5943600" cy="4273550"/>
+                    </a:xfrm>
+                    <a:prstGeom prst="rect">
+                      <a:avLst/>
+                    </a:prstGeom>
+                  </pic:spPr>
+                </pic:pic>
+              </a:graphicData>
+            </a:graphic>
+          </wp:inline>
+        </w:drawing>
+      </w:r>
+    </w:p>
+    <w:p>
+      <w:pPr>
+        <w:pStyle w:val="ListParagraph"/>
+        <w:numPr>
+          <w:ilvl w:val="0"/>
+          <w:numId w:val="3"/>
+        </w:numPr>
+      </w:pPr>
+      <w:r>
+        <w:lastRenderedPageBreak/>
+        <w:t>hiển thị tên sản phẩm đó</w:t>
+      </w:r>
+    </w:p>
+    <w:p>
+      <w:r>
+        <w:br w:type="page"/>
+      </w:r>
+      <w:r>
+        <w:lastRenderedPageBreak/>
+        <w:br w:type="page"/>
+      </w:r>
+    </w:p>
+    <w:p>
+      <w:pPr>
+        <w:rPr>
+          <w:b/>
+          <w:bCs/>
+          <w:sz w:val="32"/>
+          <w:szCs w:val="32"/>
+        </w:rPr>
+      </w:pPr>
+      <w:r>
+        <w:rPr>
+          <w:b/>
+          <w:bCs/>
+          <w:sz w:val="32"/>
+          <w:szCs w:val="32"/>
+        </w:rPr>
+        <w:lastRenderedPageBreak/>
+        <w:t>CHECK LỖ VIEW:</w:t>
+      </w:r>
+    </w:p>
+    <w:p>
+      <w:r>
+        <w:t>&lt;</w:t>
+      </w:r>
+      <w:r>
+        <w:rPr>
+          <w:b/>
+          <w:bCs/>
+        </w:rPr>
+        <w:t>div</w:t>
+      </w:r>
+      <w:r>
+        <w:t xml:space="preserve"> </w:t>
+      </w:r>
+      <w:r>
+        <w:rPr>
+          <w:b/>
+          <w:bCs/>
+        </w:rPr>
+        <w:t>asp-validation-summary</w:t>
+      </w:r>
+      <w:r>
+        <w:t>="All" class="text-danger"&gt;&lt;/</w:t>
+      </w:r>
+      <w:r>
+        <w:rPr>
+          <w:b/>
+          <w:bCs/>
+        </w:rPr>
+        <w:t>div</w:t>
+      </w:r>
+      <w:r>
+        <w:t>&gt;</w:t>
+      </w:r>
+    </w:p>
+    <w:p>
+      <w:r>
+        <w:drawing>
+          <wp:inline distT="0" distB="0" distL="0" distR="0" wp14:anchorId="75479F94" wp14:editId="4AF322A7">
+            <wp:extent cx="5943600" cy="803910"/>
+            <wp:effectExtent l="0" t="0" r="0" b="0"/>
+            <wp:docPr id="1551440781" name="Picture 1"/>
+            <wp:cNvGraphicFramePr>
+              <a:graphicFrameLocks xmlns:a="http://schemas.openxmlformats.org/drawingml/2006/main" noChangeAspect="1"/>
+            </wp:cNvGraphicFramePr>
+            <a:graphic xmlns:a="http://schemas.openxmlformats.org/drawingml/2006/main">
+              <a:graphicData uri="http://schemas.openxmlformats.org/drawingml/2006/picture">
+                <pic:pic xmlns:pic="http://schemas.openxmlformats.org/drawingml/2006/picture">
+                  <pic:nvPicPr>
+                    <pic:cNvPr id="1551440781" name=""/>
+                    <pic:cNvPicPr/>
+                  </pic:nvPicPr>
+                  <pic:blipFill>
+                    <a:blip r:embed="rId15"/>
+                    <a:stretch>
+                      <a:fillRect/>
+                    </a:stretch>
+                  </pic:blipFill>
+                  <pic:spPr>
+                    <a:xfrm>
+                      <a:off x="0" y="0"/>
+                      <a:ext cx="5943600" cy="803910"/>
+                    </a:xfrm>
+                    <a:prstGeom prst="rect">
+                      <a:avLst/>
+                    </a:prstGeom>
+                  </pic:spPr>
+                </pic:pic>
+              </a:graphicData>
+            </a:graphic>
+          </wp:inline>
+        </w:drawing>
+      </w:r>
+    </w:p>
+    <w:p/>
     <w:sectPr>
       <w:pgSz w:w="12240" w:h="15840"/>
       <w:pgMar w:top="1440" w:right="1440" w:bottom="1440" w:left="1440" w:header="720" w:footer="720" w:gutter="0"/>
@@ -1618,7 +2038,6 @@
   <w:style w:type="character" w:default="1" w:styleId="DefaultParagraphFont">
     <w:name w:val="Default Paragraph Font"/>
     <w:uiPriority w:val="1"/>
-    <w:semiHidden/>
     <w:unhideWhenUsed/>
   </w:style>
   <w:style w:type="table" w:default="1" w:styleId="TableNormal">

</xml_diff>